<commit_message>
Complete training workflow and acceptance hardening
</commit_message>
<xml_diff>
--- a/docs/delivery/lct-hack-accompanying-documentation.docx
+++ b/docs/delivery/lct-hack-accompanying-documentation.docx
@@ -216,7 +216,7 @@
               <w:rPr>
                 <w:sz w:val="17"/>
               </w:rPr>
-              <w:t>23 сентября 2026 года</w:t>
+              <w:t>25 сентября 2026 года</w:t>
             </w:r>
           </w:p>
         </w:tc>
@@ -387,7 +387,7 @@
         <w:spacing w:before="440" w:line="288" w:lineRule="auto"/>
       </w:pPr>
       <w:r>
-        <w:t>Документ описывает реализованный прототип, порядок его развёртывания и границы подтверждённого соответствия. Основной учебный путь работает локально без голосовых моделей. Локальный SIP сервер, полная приёмка на целевом оборудовании и испытание со 100 браузерами остаются отдельными обязательными работами и не заявлены выполненными.</w:t>
+        <w:t>Документ описывает реализованный локальный прототип, порядок его развёртывания и границы подтверждённого соответствия. Основной путь ДДС и локальная телефония с Asterisk проверены на разработческой машине. Локально также проверены 20 занятий и 100 браузерных интерфейсов при ramp-up 2 секунды. Приёмка на целевом сервере, в Windows/LAN и с реальными гарнитурами остаётся обязательной; её результаты здесь не заявлены.</w:t>
       </w:r>
     </w:p>
     <w:p>
@@ -1065,7 +1065,7 @@
               <w:rPr>
                 <w:sz w:val="17"/>
               </w:rPr>
-              <w:t>SIP и VoIP</w:t>
+              <w:t>Локальная телефония</w:t>
             </w:r>
           </w:p>
         </w:tc>
@@ -1089,7 +1089,7 @@
               <w:rPr>
                 <w:sz w:val="17"/>
               </w:rPr>
-              <w:t>Не реализовано</w:t>
+              <w:t>Реализовано</w:t>
             </w:r>
           </w:p>
         </w:tc>
@@ -1113,7 +1113,7 @@
               <w:rPr>
                 <w:sz w:val="17"/>
               </w:rPr>
-              <w:t>В ДДС используется учебная событийная имитация</w:t>
+              <w:t>Asterisk, SIP/WebRTC и вызов ДДС ↔ старший; звонок заявителю не входит в MVP</w:t>
             </w:r>
           </w:p>
         </w:tc>
@@ -2272,7 +2272,7 @@
               <w:rPr>
                 <w:sz w:val="17"/>
               </w:rPr>
-              <w:t>STT</w:t>
+              <w:t>Телефония</w:t>
             </w:r>
           </w:p>
         </w:tc>
@@ -2296,7 +2296,7 @@
               <w:rPr>
                 <w:sz w:val="17"/>
               </w:rPr>
-              <w:t>whisper.cpp Whisper small</w:t>
+              <w:t>Asterisk SIP/WebRTC</w:t>
             </w:r>
           </w:p>
         </w:tc>
@@ -2320,7 +2320,7 @@
               <w:rPr>
                 <w:sz w:val="17"/>
               </w:rPr>
-              <w:t>Экспериментальное распознавание голосового режима</w:t>
+              <w:t>Связь ДДС со старшим группы; свободная речь не оценивается событийным протоколом</w:t>
             </w:r>
           </w:p>
         </w:tc>
@@ -2348,6 +2348,81 @@
               <w:rPr>
                 <w:sz w:val="17"/>
               </w:rPr>
+              <w:t>STT</w:t>
+            </w:r>
+          </w:p>
+        </w:tc>
+        <w:tc>
+          <w:tcPr>
+            <w:tcW w:type="dxa" w:w="2376"/>
+            <w:tcMar>
+              <w:top w:w="110" w:type="dxa"/>
+              <w:start w:w="120" w:type="dxa"/>
+              <w:bottom w:w="110" w:type="dxa"/>
+              <w:end w:w="120" w:type="dxa"/>
+            </w:tcMar>
+            <w:vAlign w:val="center"/>
+          </w:tcPr>
+          <w:p>
+            <w:pPr>
+              <w:spacing w:after="0" w:line="245" w:lineRule="auto"/>
+            </w:pPr>
+            <w:r>
+              <w:rPr>
+                <w:sz w:val="17"/>
+              </w:rPr>
+              <w:t>whisper.cpp Whisper small</w:t>
+            </w:r>
+          </w:p>
+        </w:tc>
+        <w:tc>
+          <w:tcPr>
+            <w:tcW w:type="dxa" w:w="4824"/>
+            <w:tcMar>
+              <w:top w:w="110" w:type="dxa"/>
+              <w:start w:w="120" w:type="dxa"/>
+              <w:bottom w:w="110" w:type="dxa"/>
+              <w:end w:w="120" w:type="dxa"/>
+            </w:tcMar>
+            <w:vAlign w:val="center"/>
+          </w:tcPr>
+          <w:p>
+            <w:pPr>
+              <w:spacing w:after="0" w:line="245" w:lineRule="auto"/>
+            </w:pPr>
+            <w:r>
+              <w:rPr>
+                <w:sz w:val="17"/>
+              </w:rPr>
+              <w:t>Необязательный голосовой эксперимент, выключен по умолчанию</w:t>
+            </w:r>
+          </w:p>
+        </w:tc>
+      </w:tr>
+      <w:tr>
+        <w:trPr>
+          <w:cantSplit/>
+        </w:trPr>
+        <w:tc>
+          <w:tcPr>
+            <w:tcW w:type="dxa" w:w="1944"/>
+            <w:tcMar>
+              <w:top w:w="110" w:type="dxa"/>
+              <w:start w:w="120" w:type="dxa"/>
+              <w:bottom w:w="110" w:type="dxa"/>
+              <w:end w:w="120" w:type="dxa"/>
+            </w:tcMar>
+            <w:vAlign w:val="center"/>
+            <w:shd w:fill="EAF1F5"/>
+          </w:tcPr>
+          <w:p>
+            <w:pPr>
+              <w:spacing w:after="0" w:line="245" w:lineRule="auto"/>
+            </w:pPr>
+            <w:r>
+              <w:rPr>
+                <w:sz w:val="17"/>
+              </w:rPr>
               <w:t>Жёсткий протокол</w:t>
             </w:r>
           </w:p>
@@ -2362,6 +2437,7 @@
               <w:end w:w="120" w:type="dxa"/>
             </w:tcMar>
             <w:vAlign w:val="center"/>
+            <w:shd w:fill="EAF1F5"/>
           </w:tcPr>
           <w:p>
             <w:pPr>
@@ -2385,6 +2461,7 @@
               <w:end w:w="120" w:type="dxa"/>
             </w:tcMar>
             <w:vAlign w:val="center"/>
+            <w:shd w:fill="EAF1F5"/>
           </w:tcPr>
           <w:p>
             <w:pPr>
@@ -2720,7 +2797,7 @@
               <w:rPr>
                 <w:sz w:val="17"/>
               </w:rPr>
-              <w:t>OpenAI совместимый HTTP на loopback</w:t>
+              <w:t>OpenAI-совместимый HTTP на loopback</w:t>
             </w:r>
           </w:p>
         </w:tc>
@@ -2772,6 +2849,82 @@
               <w:rPr>
                 <w:sz w:val="17"/>
               </w:rPr>
+              <w:t>АРМ ДДС ↔ Asterisk</w:t>
+            </w:r>
+          </w:p>
+        </w:tc>
+        <w:tc>
+          <w:tcPr>
+            <w:tcW w:type="dxa" w:w="2880"/>
+            <w:tcMar>
+              <w:top w:w="110" w:type="dxa"/>
+              <w:start w:w="120" w:type="dxa"/>
+              <w:bottom w:w="110" w:type="dxa"/>
+              <w:end w:w="120" w:type="dxa"/>
+            </w:tcMar>
+            <w:vAlign w:val="center"/>
+            <w:shd w:fill="EAF1F5"/>
+          </w:tcPr>
+          <w:p>
+            <w:pPr>
+              <w:spacing w:after="0" w:line="245" w:lineRule="auto"/>
+            </w:pPr>
+            <w:r>
+              <w:rPr>
+                <w:sz w:val="17"/>
+              </w:rPr>
+              <w:t>SIP по WSS и медиапоток WebRTC</w:t>
+            </w:r>
+          </w:p>
+        </w:tc>
+        <w:tc>
+          <w:tcPr>
+            <w:tcW w:type="dxa" w:w="4032"/>
+            <w:tcMar>
+              <w:top w:w="110" w:type="dxa"/>
+              <w:start w:w="120" w:type="dxa"/>
+              <w:bottom w:w="110" w:type="dxa"/>
+              <w:end w:w="120" w:type="dxa"/>
+            </w:tcMar>
+            <w:vAlign w:val="center"/>
+            <w:shd w:fill="EAF1F5"/>
+          </w:tcPr>
+          <w:p>
+            <w:pPr>
+              <w:spacing w:after="0" w:line="245" w:lineRule="auto"/>
+            </w:pPr>
+            <w:r>
+              <w:rPr>
+                <w:sz w:val="17"/>
+              </w:rPr>
+              <w:t>Реальный учебный звонок ДДС ↔ старший группы</w:t>
+            </w:r>
+          </w:p>
+        </w:tc>
+      </w:tr>
+      <w:tr>
+        <w:trPr>
+          <w:cantSplit/>
+        </w:trPr>
+        <w:tc>
+          <w:tcPr>
+            <w:tcW w:type="dxa" w:w="2232"/>
+            <w:tcMar>
+              <w:top w:w="110" w:type="dxa"/>
+              <w:start w:w="120" w:type="dxa"/>
+              <w:bottom w:w="110" w:type="dxa"/>
+              <w:end w:w="120" w:type="dxa"/>
+            </w:tcMar>
+            <w:vAlign w:val="center"/>
+          </w:tcPr>
+          <w:p>
+            <w:pPr>
+              <w:spacing w:after="0" w:line="245" w:lineRule="auto"/>
+            </w:pPr>
+            <w:r>
+              <w:rPr>
+                <w:sz w:val="17"/>
+              </w:rPr>
               <w:t>Браузер ↔ Backend</w:t>
             </w:r>
           </w:p>
@@ -2786,7 +2939,6 @@
               <w:end w:w="120" w:type="dxa"/>
             </w:tcMar>
             <w:vAlign w:val="center"/>
-            <w:shd w:fill="EAF1F5"/>
           </w:tcPr>
           <w:p>
             <w:pPr>
@@ -2796,7 +2948,7 @@
               <w:rPr>
                 <w:sz w:val="17"/>
               </w:rPr>
-              <w:t>Бинарные WebSocket кадры</w:t>
+              <w:t>HTTP и WebSocket события</w:t>
             </w:r>
           </w:p>
         </w:tc>
@@ -2810,7 +2962,6 @@
               <w:end w:w="120" w:type="dxa"/>
             </w:tcMar>
             <w:vAlign w:val="center"/>
-            <w:shd w:fill="EAF1F5"/>
           </w:tcPr>
           <w:p>
             <w:pPr>
@@ -2820,7 +2971,7 @@
               <w:rPr>
                 <w:sz w:val="17"/>
               </w:rPr>
-              <w:t>Экспериментальный аудиопоток</w:t>
+              <w:t>Авторизация, команды и журнал занятия</w:t>
             </w:r>
           </w:p>
         </w:tc>
@@ -2893,7 +3044,7 @@
     </w:p>
     <w:p>
       <w:r>
-        <w:t>Система формирует экранный отчёт, CSV и PDF. В отчёте сохраняются критерии занятия, итоговый балл, нарушенные метрики, временные показатели и статус зачёта. Групповая аналитика агрегирует сохранённые попытки и показывает частые ошибки и рекомендации по правилам.</w:t>
+        <w:t>Система формирует экранный отчёт, CSV и PDF. В отчёте сохраняются критерии занятия, итоговый балл, нарушенные метрики, временные показатели и статус зачёта. Групповая аналитика агрегирует сохранённые попытки и показывает частые ошибки и рекомендации по правилам. Курсант может отправить полный КИО преподавателю как черновик; только после утверждения он появляется в банке карточек ДДС.</w:t>
       </w:r>
     </w:p>
     <w:p>
@@ -3137,7 +3288,7 @@
               <w:rPr>
                 <w:sz w:val="17"/>
               </w:rPr>
-              <w:t>Сценарии задания критерии наблюдение директивы отчёты и аналитика</w:t>
+              <w:t>Сценарии занятия критерии режим наблюдения отчёты и аналитика</w:t>
             </w:r>
           </w:p>
         </w:tc>
@@ -3236,83 +3387,6 @@
                 <w:sz w:val="17"/>
               </w:rPr>
               <w:t>Не видит эталон чужие результаты и админ функции</w:t>
-            </w:r>
-          </w:p>
-        </w:tc>
-      </w:tr>
-      <w:tr>
-        <w:trPr>
-          <w:cantSplit/>
-        </w:trPr>
-        <w:tc>
-          <w:tcPr>
-            <w:tcW w:type="dxa" w:w="1800"/>
-            <w:tcMar>
-              <w:top w:w="110" w:type="dxa"/>
-              <w:start w:w="120" w:type="dxa"/>
-              <w:bottom w:w="110" w:type="dxa"/>
-              <w:end w:w="120" w:type="dxa"/>
-            </w:tcMar>
-            <w:vAlign w:val="center"/>
-            <w:shd w:fill="EAF1F5"/>
-          </w:tcPr>
-          <w:p>
-            <w:pPr>
-              <w:spacing w:after="0" w:line="245" w:lineRule="auto"/>
-            </w:pPr>
-            <w:r>
-              <w:rPr>
-                <w:sz w:val="17"/>
-              </w:rPr>
-              <w:t>Наблюдатель</w:t>
-            </w:r>
-          </w:p>
-        </w:tc>
-        <w:tc>
-          <w:tcPr>
-            <w:tcW w:type="dxa" w:w="4464"/>
-            <w:tcMar>
-              <w:top w:w="110" w:type="dxa"/>
-              <w:start w:w="120" w:type="dxa"/>
-              <w:bottom w:w="110" w:type="dxa"/>
-              <w:end w:w="120" w:type="dxa"/>
-            </w:tcMar>
-            <w:vAlign w:val="center"/>
-            <w:shd w:fill="EAF1F5"/>
-          </w:tcPr>
-          <w:p>
-            <w:pPr>
-              <w:spacing w:after="0" w:line="245" w:lineRule="auto"/>
-            </w:pPr>
-            <w:r>
-              <w:rPr>
-                <w:sz w:val="17"/>
-              </w:rPr>
-              <w:t>Монитор хода занятия и итогового разбора</w:t>
-            </w:r>
-          </w:p>
-        </w:tc>
-        <w:tc>
-          <w:tcPr>
-            <w:tcW w:type="dxa" w:w="3384"/>
-            <w:tcMar>
-              <w:top w:w="110" w:type="dxa"/>
-              <w:start w:w="120" w:type="dxa"/>
-              <w:bottom w:w="110" w:type="dxa"/>
-              <w:end w:w="120" w:type="dxa"/>
-            </w:tcMar>
-            <w:vAlign w:val="center"/>
-            <w:shd w:fill="EAF1F5"/>
-          </w:tcPr>
-          <w:p>
-            <w:pPr>
-              <w:spacing w:after="0" w:line="245" w:lineRule="auto"/>
-            </w:pPr>
-            <w:r>
-              <w:rPr>
-                <w:sz w:val="17"/>
-              </w:rPr>
-              <w:t>Не отправляет учебные команды</w:t>
             </w:r>
           </w:p>
         </w:tc>
@@ -3707,7 +3781,7 @@
               <w:rPr>
                 <w:sz w:val="17"/>
               </w:rPr>
-              <w:t>Экспериментальный вызов</w:t>
+              <w:t>Необязательный эксперимент</w:t>
             </w:r>
           </w:p>
         </w:tc>
@@ -3731,7 +3805,7 @@
               <w:rPr>
                 <w:sz w:val="17"/>
               </w:rPr>
-              <w:t>Карточка и разбор разговора</w:t>
+              <w:t>STT отключён по умолчанию и требует отдельной приёмки</w:t>
             </w:r>
           </w:p>
         </w:tc>
@@ -4755,6 +4829,32 @@
     <w:p>
       <w:r>
         <w:t>На изолированном стенде загрузить архив командой docker load -i lct-hack-images.tar, затем выполнить docker compose up --pull never --no-build. Репозиторий и каталог scenarios переносятся вместе с архивом. Холодная сборка зависимостей без заранее подготовленных образов не заявлена.</w:t>
+      </w:r>
+    </w:p>
+    <w:p>
+      <w:r>
+        <w:t>Для Windows выполните эквивалентные команды в PowerShell из корня репозитория; переносите архив образов, репозиторий и настроенный .env на стенд.</w:t>
+      </w:r>
+    </w:p>
+    <w:p>
+      <w:pPr>
+        <w:pStyle w:val="Code"/>
+        <w:keepLines/>
+      </w:pPr>
+      <w:r>
+        <w:t>docker compose pull postgres</w:t>
+        <w:br/>
+        <w:t>docker compose build backend frontend</w:t>
+        <w:br/>
+        <w:t>docker compose -f docker-compose.yml -f docker-compose.sip.yml build sip</w:t>
+        <w:br/>
+        <w:t>docker save --output lct-hack-images.tar postgres:16-alpine lct-hack-backend:local lct-hack-frontend:local lct-hack-sip:local</w:t>
+        <w:br/>
+        <w:t># На стенде Windows:</w:t>
+        <w:br/>
+        <w:t>docker load --input lct-hack-images.tar</w:t>
+        <w:br/>
+        <w:t>docker compose up --pull never --no-build --detach</w:t>
       </w:r>
     </w:p>
     <w:p>
@@ -4942,7 +5042,7 @@
     </w:p>
     <w:p>
       <w:r>
-        <w:t>Команда make backup вызывает backend/scripts/backup.py и создаёт дамп PostgreSQL. Для выполнения требования о ежедневной периодичности команду нужно поставить в планировщик конкретного стенда. Восстановление проверяется на отдельной базе до ввода стенда в эксплуатацию.</w:t>
+        <w:t>В стандартной конфигурации Docker Compose отдельный сервис backup сразу создаёт копию PostgreSQL, затем проверяет и повторяет её не реже раза в сутки, при временной ошибке запускает повторную попытку. Срок хранения и место для тома backups настраиваются под стенд. При нативной установке без Compose команду make backup нужно добавить во внешний планировщик: например, Task Scheduler на Windows или cron на Linux. Восстановление проверяется на отдельной базе до ввода стенда в эксплуатацию.</w:t>
       </w:r>
     </w:p>
     <w:p>
@@ -5110,7 +5210,7 @@
               <w:rPr>
                 <w:sz w:val="17"/>
               </w:rPr>
-              <w:t>Локальные учётные записи и cookie сессии</w:t>
+              <w:t>Локальные учётные записи; опционально AD/LDAP по LDAPS/StartTLS и группам</w:t>
             </w:r>
           </w:p>
         </w:tc>
@@ -5133,7 +5233,7 @@
               <w:rPr>
                 <w:sz w:val="17"/>
               </w:rPr>
-              <w:t>Заменить SESSION_SECRET и отключить DEV_AUTH_BYPASS</w:t>
+              <w:t>Заменить SESSION_SECRET, настроить CA/DN групп и отключить DEV_AUTH_BYPASS</w:t>
             </w:r>
           </w:p>
         </w:tc>
@@ -5412,7 +5512,7 @@
               <w:rPr>
                 <w:sz w:val="17"/>
               </w:rPr>
-              <w:t>Скрипт pg_dump</w:t>
+              <w:t>Compose-сервис: первая копия при старте, затем ежедневно; хранится 14 копий</w:t>
             </w:r>
           </w:p>
         </w:tc>
@@ -5435,7 +5535,7 @@
               <w:rPr>
                 <w:sz w:val="17"/>
               </w:rPr>
-              <w:t>Настроить ежедневный планировщик и тест восстановления</w:t>
+              <w:t>Проверить расписание и восстановление на целевом стенде</w:t>
             </w:r>
           </w:p>
         </w:tc>
@@ -5563,7 +5663,7 @@
               <w:rPr>
                 <w:sz w:val="17"/>
               </w:rPr>
-              <w:t>В коде приложения не завершён</w:t>
+              <w:t>Профиль Nginx: HTTPS/WSS, TLS 1.2/1.3, Secure-cookie</w:t>
             </w:r>
           </w:p>
         </w:tc>
@@ -5586,7 +5686,7 @@
               <w:rPr>
                 <w:sz w:val="17"/>
               </w:rPr>
-              <w:t>Поставить локальный reverse proxy и сертификаты</w:t>
+              <w:t>Заменить bootstrap-сертификат сертификатом внутреннего УЦ и установить доверие</w:t>
             </w:r>
           </w:p>
         </w:tc>
@@ -5744,7 +5844,7 @@
               <w:rPr>
                 <w:sz w:val="17"/>
               </w:rPr>
-              <w:t>Backend WebSocket нагрузка</w:t>
+              <w:t>Backend suite</w:t>
             </w:r>
           </w:p>
         </w:tc>
@@ -5767,7 +5867,7 @@
               <w:rPr>
                 <w:sz w:val="17"/>
               </w:rPr>
-              <w:t>20 занятий 100 клиентов p95 4.88 мс</w:t>
+              <w:t>410 passed, 17 skipped, 3 deselected</w:t>
             </w:r>
           </w:p>
         </w:tc>
@@ -5790,7 +5890,7 @@
               <w:rPr>
                 <w:sz w:val="17"/>
               </w:rPr>
-              <w:t>demo no db текущая машина не браузер и не VoIP</w:t>
+              <w:t>15 PostgreSQL-тестов требуют доступной БД; 2 опциональных голосовых/модельных; 3 live-LLM теста исключены стандартным маркером</w:t>
             </w:r>
           </w:p>
         </w:tc>
@@ -5819,7 +5919,7 @@
               <w:rPr>
                 <w:sz w:val="17"/>
               </w:rPr>
-              <w:t>Fan out наблюдателям</w:t>
+              <w:t>Backend WebSocket нагрузка</w:t>
             </w:r>
           </w:p>
         </w:tc>
@@ -5843,7 +5943,7 @@
               <w:rPr>
                 <w:sz w:val="17"/>
               </w:rPr>
-              <w:t>800 из 800 событий</w:t>
+              <w:t>20 занятий / 100 клиентов, p95 события 4,88 мс</w:t>
             </w:r>
           </w:p>
         </w:tc>
@@ -5867,7 +5967,7 @@
               <w:rPr>
                 <w:sz w:val="17"/>
               </w:rPr>
-              <w:t>80 наблюдателей в локальном прогоне</w:t>
+              <w:t>Локальная машина; не целевой сервер и не браузерный интерфейс</w:t>
             </w:r>
           </w:p>
         </w:tc>
@@ -5895,7 +5995,7 @@
               <w:rPr>
                 <w:sz w:val="17"/>
               </w:rPr>
-              <w:t>ИИ сценарии</w:t>
+              <w:t>Браузерная нагрузка</w:t>
             </w:r>
           </w:p>
         </w:tc>
@@ -5918,7 +6018,7 @@
               <w:rPr>
                 <w:sz w:val="17"/>
               </w:rPr>
-              <w:t>Строгая структура и серверная валидация</w:t>
+              <w:t>100 Chromium-интерфейсов: p95 загрузки 659 мс, ошибок нет при ramp-up 2 с</w:t>
             </w:r>
           </w:p>
         </w:tc>
@@ -5941,7 +6041,7 @@
               <w:rPr>
                 <w:sz w:val="17"/>
               </w:rPr>
-              <w:t>Качество всех 96 сюжетов не оценено методистом</w:t>
+              <w:t>Локальный стенд; 100 разных учётных записей и целевое железо не проверены</w:t>
             </w:r>
           </w:p>
         </w:tc>
@@ -5970,7 +6070,7 @@
               <w:rPr>
                 <w:sz w:val="17"/>
               </w:rPr>
-              <w:t>Frontend</w:t>
+              <w:t>Fan out наблюдателям</w:t>
             </w:r>
           </w:p>
         </w:tc>
@@ -5994,7 +6094,7 @@
               <w:rPr>
                 <w:sz w:val="17"/>
               </w:rPr>
-              <w:t>TypeScript проверка и production build</w:t>
+              <w:t>800 из 800 событий</w:t>
             </w:r>
           </w:p>
         </w:tc>
@@ -6018,7 +6118,7 @@
               <w:rPr>
                 <w:sz w:val="17"/>
               </w:rPr>
-              <w:t>Не заменяет тест на реальных мобильных устройствах</w:t>
+              <w:t>80 наблюдателей в локальном прогоне</w:t>
             </w:r>
           </w:p>
         </w:tc>
@@ -6046,7 +6146,7 @@
               <w:rPr>
                 <w:sz w:val="17"/>
               </w:rPr>
-              <w:t>Отчёт</w:t>
+              <w:t>Запись PostgreSQL</w:t>
             </w:r>
           </w:p>
         </w:tc>
@@ -6069,7 +6169,7 @@
               <w:rPr>
                 <w:sz w:val="17"/>
               </w:rPr>
-              <w:t>CSV и PDF покрыты тестами</w:t>
+              <w:t>1000 последовательных INSERT: 4514 операций/с</w:t>
             </w:r>
           </w:p>
         </w:tc>
@@ -6092,7 +6192,7 @@
               <w:rPr>
                 <w:sz w:val="17"/>
               </w:rPr>
-              <w:t>PDF отчёта не является сертификатом</w:t>
+              <w:t>Временная таблица; смешанная бизнес-нагрузка и целевое железо не проверены</w:t>
             </w:r>
           </w:p>
         </w:tc>
@@ -6121,7 +6221,7 @@
               <w:rPr>
                 <w:sz w:val="17"/>
               </w:rPr>
-              <w:t>Голос</w:t>
+              <w:t>ИИ сценарии</w:t>
             </w:r>
           </w:p>
         </w:tc>
@@ -6145,7 +6245,7 @@
               <w:rPr>
                 <w:sz w:val="17"/>
               </w:rPr>
-              <w:t>Whisper small не принят по скорости</w:t>
+              <w:t>Строгая структура и серверная валидация</w:t>
             </w:r>
           </w:p>
         </w:tc>
@@ -6169,7 +6269,232 @@
               <w:rPr>
                 <w:sz w:val="17"/>
               </w:rPr>
-              <w:t>Нужен замер на целевом сервере</w:t>
+              <w:t>Качество всех 96 сюжетов не оценено методистом</w:t>
+            </w:r>
+          </w:p>
+        </w:tc>
+      </w:tr>
+      <w:tr>
+        <w:trPr>
+          <w:cantSplit/>
+        </w:trPr>
+        <w:tc>
+          <w:tcPr>
+            <w:tcW w:type="dxa" w:w="3024"/>
+            <w:tcMar>
+              <w:top w:w="110" w:type="dxa"/>
+              <w:start w:w="120" w:type="dxa"/>
+              <w:bottom w:w="110" w:type="dxa"/>
+              <w:end w:w="120" w:type="dxa"/>
+            </w:tcMar>
+            <w:vAlign w:val="center"/>
+          </w:tcPr>
+          <w:p>
+            <w:pPr>
+              <w:spacing w:after="0" w:line="245" w:lineRule="auto"/>
+            </w:pPr>
+            <w:r>
+              <w:rPr>
+                <w:sz w:val="17"/>
+              </w:rPr>
+              <w:t>Frontend</w:t>
+            </w:r>
+          </w:p>
+        </w:tc>
+        <w:tc>
+          <w:tcPr>
+            <w:tcW w:type="dxa" w:w="2952"/>
+            <w:tcMar>
+              <w:top w:w="110" w:type="dxa"/>
+              <w:start w:w="120" w:type="dxa"/>
+              <w:bottom w:w="110" w:type="dxa"/>
+              <w:end w:w="120" w:type="dxa"/>
+            </w:tcMar>
+            <w:vAlign w:val="center"/>
+          </w:tcPr>
+          <w:p>
+            <w:pPr>
+              <w:spacing w:after="0" w:line="245" w:lineRule="auto"/>
+            </w:pPr>
+            <w:r>
+              <w:rPr>
+                <w:sz w:val="17"/>
+              </w:rPr>
+              <w:t>TypeScript проверка и production build</w:t>
+            </w:r>
+          </w:p>
+        </w:tc>
+        <w:tc>
+          <w:tcPr>
+            <w:tcW w:type="dxa" w:w="3672"/>
+            <w:tcMar>
+              <w:top w:w="110" w:type="dxa"/>
+              <w:start w:w="120" w:type="dxa"/>
+              <w:bottom w:w="110" w:type="dxa"/>
+              <w:end w:w="120" w:type="dxa"/>
+            </w:tcMar>
+            <w:vAlign w:val="center"/>
+          </w:tcPr>
+          <w:p>
+            <w:pPr>
+              <w:spacing w:after="0" w:line="245" w:lineRule="auto"/>
+            </w:pPr>
+            <w:r>
+              <w:rPr>
+                <w:sz w:val="17"/>
+              </w:rPr>
+              <w:t>Не заменяет тест на реальных мобильных устройствах</w:t>
+            </w:r>
+          </w:p>
+        </w:tc>
+      </w:tr>
+      <w:tr>
+        <w:trPr>
+          <w:cantSplit/>
+        </w:trPr>
+        <w:tc>
+          <w:tcPr>
+            <w:tcW w:type="dxa" w:w="3024"/>
+            <w:tcMar>
+              <w:top w:w="110" w:type="dxa"/>
+              <w:start w:w="120" w:type="dxa"/>
+              <w:bottom w:w="110" w:type="dxa"/>
+              <w:end w:w="120" w:type="dxa"/>
+            </w:tcMar>
+            <w:vAlign w:val="center"/>
+            <w:shd w:fill="EAF1F5"/>
+          </w:tcPr>
+          <w:p>
+            <w:pPr>
+              <w:spacing w:after="0" w:line="245" w:lineRule="auto"/>
+            </w:pPr>
+            <w:r>
+              <w:rPr>
+                <w:sz w:val="17"/>
+              </w:rPr>
+              <w:t>Отчёт</w:t>
+            </w:r>
+          </w:p>
+        </w:tc>
+        <w:tc>
+          <w:tcPr>
+            <w:tcW w:type="dxa" w:w="2952"/>
+            <w:tcMar>
+              <w:top w:w="110" w:type="dxa"/>
+              <w:start w:w="120" w:type="dxa"/>
+              <w:bottom w:w="110" w:type="dxa"/>
+              <w:end w:w="120" w:type="dxa"/>
+            </w:tcMar>
+            <w:vAlign w:val="center"/>
+            <w:shd w:fill="EAF1F5"/>
+          </w:tcPr>
+          <w:p>
+            <w:pPr>
+              <w:spacing w:after="0" w:line="245" w:lineRule="auto"/>
+            </w:pPr>
+            <w:r>
+              <w:rPr>
+                <w:sz w:val="17"/>
+              </w:rPr>
+              <w:t>JSON/CSV/PDF формируются после перезапуска backend; локальный PDF за 191 мс</w:t>
+            </w:r>
+          </w:p>
+        </w:tc>
+        <w:tc>
+          <w:tcPr>
+            <w:tcW w:type="dxa" w:w="3672"/>
+            <w:tcMar>
+              <w:top w:w="110" w:type="dxa"/>
+              <w:start w:w="120" w:type="dxa"/>
+              <w:bottom w:w="110" w:type="dxa"/>
+              <w:end w:w="120" w:type="dxa"/>
+            </w:tcMar>
+            <w:vAlign w:val="center"/>
+            <w:shd w:fill="EAF1F5"/>
+          </w:tcPr>
+          <w:p>
+            <w:pPr>
+              <w:spacing w:after="0" w:line="245" w:lineRule="auto"/>
+            </w:pPr>
+            <w:r>
+              <w:rPr>
+                <w:sz w:val="17"/>
+              </w:rPr>
+              <w:t>Предельная групповая аналитика и целевой сервер не проверены; сертификат не квалификационный</w:t>
+            </w:r>
+          </w:p>
+        </w:tc>
+      </w:tr>
+      <w:tr>
+        <w:trPr>
+          <w:cantSplit/>
+        </w:trPr>
+        <w:tc>
+          <w:tcPr>
+            <w:tcW w:type="dxa" w:w="3024"/>
+            <w:tcMar>
+              <w:top w:w="110" w:type="dxa"/>
+              <w:start w:w="120" w:type="dxa"/>
+              <w:bottom w:w="110" w:type="dxa"/>
+              <w:end w:w="120" w:type="dxa"/>
+            </w:tcMar>
+            <w:vAlign w:val="center"/>
+          </w:tcPr>
+          <w:p>
+            <w:pPr>
+              <w:spacing w:after="0" w:line="245" w:lineRule="auto"/>
+            </w:pPr>
+            <w:r>
+              <w:rPr>
+                <w:sz w:val="17"/>
+              </w:rPr>
+              <w:t>Голосовая запись</w:t>
+            </w:r>
+          </w:p>
+        </w:tc>
+        <w:tc>
+          <w:tcPr>
+            <w:tcW w:type="dxa" w:w="2952"/>
+            <w:tcMar>
+              <w:top w:w="110" w:type="dxa"/>
+              <w:start w:w="120" w:type="dxa"/>
+              <w:bottom w:w="110" w:type="dxa"/>
+              <w:end w:w="120" w:type="dxa"/>
+            </w:tcMar>
+            <w:vAlign w:val="center"/>
+          </w:tcPr>
+          <w:p>
+            <w:pPr>
+              <w:spacing w:after="0" w:line="245" w:lineRule="auto"/>
+            </w:pPr>
+            <w:r>
+              <w:rPr>
+                <w:sz w:val="17"/>
+              </w:rPr>
+              <w:t>Локальный WAV 16 кГц записан и скачан в smoke-тесте</w:t>
+            </w:r>
+          </w:p>
+        </w:tc>
+        <w:tc>
+          <w:tcPr>
+            <w:tcW w:type="dxa" w:w="3672"/>
+            <w:tcMar>
+              <w:top w:w="110" w:type="dxa"/>
+              <w:start w:w="120" w:type="dxa"/>
+              <w:bottom w:w="110" w:type="dxa"/>
+              <w:end w:w="120" w:type="dxa"/>
+            </w:tcMar>
+            <w:vAlign w:val="center"/>
+          </w:tcPr>
+          <w:p>
+            <w:pPr>
+              <w:spacing w:after="0" w:line="245" w:lineRule="auto"/>
+            </w:pPr>
+            <w:r>
+              <w:rPr>
+                <w:sz w:val="17"/>
+              </w:rPr>
+              <w:t>В прогоне TTS был выключен; обе аудиодорожки и целевое железо не приняты</w:t>
             </w:r>
           </w:p>
         </w:tc>
@@ -6182,7 +6507,7 @@
     </w:p>
     <w:p>
       <w:r>
-        <w:t>Машинно читаемый результат нагрузки хранится в docs/evidence/load-dds-2026-09-23.json. Для формальной приёмки требуется повторить прогон с PostgreSQL на сервере заказчика, измерить браузерную отрисовку, 100 операций записи в секунду, отчёт до 30 секунд и восстановление после 30 секунд сетевого сбоя.</w:t>
+        <w:t>Машинно читаемые результаты и методика приведены в docs/arch/LOAD-TEST.md и docs/evidence. Локальные прогоны подтверждают заданные показатели только в описанных конфигурациях. На сервере заказчика нужно повторить смешанную нагрузку, проверить 100 операций записи в секунду на продуктовых транзакциях, групповые отчёты, реальную сеть и восстановление после 30-секундного обрыва.</w:t>
       </w:r>
     </w:p>
     <w:p>
@@ -6327,7 +6652,7 @@
               <w:rPr>
                 <w:sz w:val="17"/>
               </w:rPr>
-              <w:t>Локальный SIP сервер</w:t>
+              <w:t>PostgreSQL интеграционные тесты</w:t>
             </w:r>
           </w:p>
         </w:tc>
@@ -6350,7 +6675,7 @@
               <w:rPr>
                 <w:sz w:val="17"/>
               </w:rPr>
-              <w:t>Отсутствует</w:t>
+              <w:t>Миграции собраны в offline SQL; полный suite пропускает 15 PostgreSQL-тестов</w:t>
             </w:r>
           </w:p>
         </w:tc>
@@ -6373,7 +6698,7 @@
               <w:rPr>
                 <w:sz w:val="17"/>
               </w:rPr>
-              <w:t>Развернуть SIP сервер подключить два софтфона и измерить задержку до 150 мс</w:t>
+              <w:t>После восстановления Docker Desktop выполнить make test-db на временной БД; проверить миграции и полный набор интеграций</w:t>
             </w:r>
           </w:p>
         </w:tc>
@@ -6402,7 +6727,7 @@
               <w:rPr>
                 <w:sz w:val="17"/>
               </w:rPr>
-              <w:t>TLS внутри контура</w:t>
+              <w:t>AD/LDAP</w:t>
             </w:r>
           </w:p>
         </w:tc>
@@ -6426,7 +6751,7 @@
               <w:rPr>
                 <w:sz w:val="17"/>
               </w:rPr>
-              <w:t>Не завершено</w:t>
+              <w:t>Адаптер LDAPS/StartTLS и group-to-role покрыт тестами с mock-каталогом; выбран пользователем, MFA исключена</w:t>
             </w:r>
           </w:p>
         </w:tc>
@@ -6450,7 +6775,7 @@
               <w:rPr>
                 <w:sz w:val="17"/>
               </w:rPr>
-              <w:t>Reverse proxy сертификаты принудительный HTTPS и WSS</w:t>
+              <w:t>Подключить тестовый AD/LDAP, сертификат УЦ и выданные заказчиком DN групп; проверить JIT provisioning и блокировку</w:t>
             </w:r>
           </w:p>
         </w:tc>
@@ -6478,7 +6803,7 @@
               <w:rPr>
                 <w:sz w:val="17"/>
               </w:rPr>
-              <w:t>100 браузеров</w:t>
+              <w:t>Локальный SIP сервер</w:t>
             </w:r>
           </w:p>
         </w:tc>
@@ -6501,7 +6826,7 @@
               <w:rPr>
                 <w:sz w:val="17"/>
               </w:rPr>
-              <w:t>Проверен только backend</w:t>
+              <w:t>Asterisk/SIP/WebRTC реализован; локальный RTP p95 2,9 мс</w:t>
             </w:r>
           </w:p>
         </w:tc>
@@ -6524,7 +6849,7 @@
               <w:rPr>
                 <w:sz w:val="17"/>
               </w:rPr>
-              <w:t>Браузерный нагрузочный прогон на целевом стенде</w:t>
+              <w:t>Проверить гарнитуры, LAN, Windows и звонок заявителю, если он потребуется вне MVP</w:t>
             </w:r>
           </w:p>
         </w:tc>
@@ -6553,7 +6878,7 @@
               <w:rPr>
                 <w:sz w:val="17"/>
               </w:rPr>
-              <w:t>PostgreSQL 100 операций в секунду</w:t>
+              <w:t>TLS внутри контура</w:t>
             </w:r>
           </w:p>
         </w:tc>
@@ -6577,7 +6902,7 @@
               <w:rPr>
                 <w:sz w:val="17"/>
               </w:rPr>
-              <w:t>Не измерено</w:t>
+              <w:t>Nginx HTTPS/WSS профиль реализован и проверен</w:t>
             </w:r>
           </w:p>
         </w:tc>
@@ -6601,7 +6926,7 @@
               <w:rPr>
                 <w:sz w:val="17"/>
               </w:rPr>
-              <w:t>Отдельный профиль записи и журналирования</w:t>
+              <w:t>Установить сертификат внутреннего УЦ и проверить рабочие места класса</w:t>
             </w:r>
           </w:p>
         </w:tc>
@@ -6629,7 +6954,7 @@
               <w:rPr>
                 <w:sz w:val="17"/>
               </w:rPr>
-              <w:t>Восстановление сети 30 секунд</w:t>
+              <w:t>100 браузеров</w:t>
             </w:r>
           </w:p>
         </w:tc>
@@ -6652,7 +6977,7 @@
               <w:rPr>
                 <w:sz w:val="17"/>
               </w:rPr>
-              <w:t>Не подтверждено</w:t>
+              <w:t>Локальный smoke: p95 659 мс при ramp-up 2 с</w:t>
             </w:r>
           </w:p>
         </w:tc>
@@ -6675,7 +7000,7 @@
               <w:rPr>
                 <w:sz w:val="17"/>
               </w:rPr>
-              <w:t>Буферизация повторное соединение и тест без потери событий</w:t>
+              <w:t>Проверить 100 учётных записей и целевой сервер</w:t>
             </w:r>
           </w:p>
         </w:tc>
@@ -6704,7 +7029,7 @@
               <w:rPr>
                 <w:sz w:val="17"/>
               </w:rPr>
-              <w:t>Горизонтальное масштабирование</w:t>
+              <w:t>PostgreSQL 100 операций в секунду</w:t>
             </w:r>
           </w:p>
         </w:tc>
@@ -6728,7 +7053,7 @@
               <w:rPr>
                 <w:sz w:val="17"/>
               </w:rPr>
-              <w:t>Живое состояние в одном процессе</w:t>
+              <w:t>Локальный последовательный INSERT: 4514 операций/с</w:t>
             </w:r>
           </w:p>
         </w:tc>
@@ -6752,7 +7077,7 @@
               <w:rPr>
                 <w:sz w:val="17"/>
               </w:rPr>
-              <w:t>Общий локальный слой состояния и маршрутизация сессий</w:t>
+              <w:t>Измерить смешанную нагрузку продуктовых транзакций на целевом сервере</w:t>
             </w:r>
           </w:p>
         </w:tc>
@@ -6780,7 +7105,7 @@
               <w:rPr>
                 <w:sz w:val="17"/>
               </w:rPr>
-              <w:t>Мобильная версия</w:t>
+              <w:t>Восстановление сети 30 секунд</w:t>
             </w:r>
           </w:p>
         </w:tc>
@@ -6803,7 +7128,7 @@
               <w:rPr>
                 <w:sz w:val="17"/>
               </w:rPr>
-              <w:t>Есть адаптивные правила</w:t>
+              <w:t>Клиент подтверждал безопасную очередь после восстановления за 8,8 с</w:t>
             </w:r>
           </w:p>
         </w:tc>
@@ -6826,7 +7151,7 @@
               <w:rPr>
                 <w:sz w:val="17"/>
               </w:rPr>
-              <w:t>Проверка реальных телефонов и исправление найденных дефектов</w:t>
+              <w:t>Проверить полный набор сценариев потери сети и границы идемпотентных повторов</w:t>
             </w:r>
           </w:p>
         </w:tc>
@@ -6855,7 +7180,7 @@
               <w:rPr>
                 <w:sz w:val="17"/>
               </w:rPr>
-              <w:t>XML и аудиозаписи</w:t>
+              <w:t>Горизонтальное масштабирование</w:t>
             </w:r>
           </w:p>
         </w:tc>
@@ -6879,7 +7204,7 @@
               <w:rPr>
                 <w:sz w:val="17"/>
               </w:rPr>
-              <w:t>Не реализованы</w:t>
+              <w:t>Живое состояние в одном процессе</w:t>
             </w:r>
           </w:p>
         </w:tc>
@@ -6903,7 +7228,7 @@
               <w:rPr>
                 <w:sz w:val="17"/>
               </w:rPr>
-              <w:t>Экспорт конфигураций и запись MP3 или WAV при включённом голосе</w:t>
+              <w:t>Общий локальный слой состояния и маршрутизация сессий</w:t>
             </w:r>
           </w:p>
         </w:tc>
@@ -6931,6 +7256,157 @@
               <w:rPr>
                 <w:sz w:val="17"/>
               </w:rPr>
+              <w:t>Мобильная версия</w:t>
+            </w:r>
+          </w:p>
+        </w:tc>
+        <w:tc>
+          <w:tcPr>
+            <w:tcW w:type="dxa" w:w="2952"/>
+            <w:tcMar>
+              <w:top w:w="110" w:type="dxa"/>
+              <w:start w:w="120" w:type="dxa"/>
+              <w:bottom w:w="110" w:type="dxa"/>
+              <w:end w:w="120" w:type="dxa"/>
+            </w:tcMar>
+            <w:vAlign w:val="center"/>
+          </w:tcPr>
+          <w:p>
+            <w:pPr>
+              <w:spacing w:after="0" w:line="245" w:lineRule="auto"/>
+            </w:pPr>
+            <w:r>
+              <w:rPr>
+                <w:sz w:val="17"/>
+              </w:rPr>
+              <w:t>Есть адаптивные правила</w:t>
+            </w:r>
+          </w:p>
+        </w:tc>
+        <w:tc>
+          <w:tcPr>
+            <w:tcW w:type="dxa" w:w="3816"/>
+            <w:tcMar>
+              <w:top w:w="110" w:type="dxa"/>
+              <w:start w:w="120" w:type="dxa"/>
+              <w:bottom w:w="110" w:type="dxa"/>
+              <w:end w:w="120" w:type="dxa"/>
+            </w:tcMar>
+            <w:vAlign w:val="center"/>
+          </w:tcPr>
+          <w:p>
+            <w:pPr>
+              <w:spacing w:after="0" w:line="245" w:lineRule="auto"/>
+            </w:pPr>
+            <w:r>
+              <w:rPr>
+                <w:sz w:val="17"/>
+              </w:rPr>
+              <w:t>Проверка реальных телефонов и исправление найденных дефектов</w:t>
+            </w:r>
+          </w:p>
+        </w:tc>
+      </w:tr>
+      <w:tr>
+        <w:trPr>
+          <w:cantSplit/>
+        </w:trPr>
+        <w:tc>
+          <w:tcPr>
+            <w:tcW w:type="dxa" w:w="2880"/>
+            <w:tcMar>
+              <w:top w:w="110" w:type="dxa"/>
+              <w:start w:w="120" w:type="dxa"/>
+              <w:bottom w:w="110" w:type="dxa"/>
+              <w:end w:w="120" w:type="dxa"/>
+            </w:tcMar>
+            <w:vAlign w:val="center"/>
+            <w:shd w:fill="EAF1F5"/>
+          </w:tcPr>
+          <w:p>
+            <w:pPr>
+              <w:spacing w:after="0" w:line="245" w:lineRule="auto"/>
+            </w:pPr>
+            <w:r>
+              <w:rPr>
+                <w:sz w:val="17"/>
+              </w:rPr>
+              <w:t>Экспорт и записи</w:t>
+            </w:r>
+          </w:p>
+        </w:tc>
+        <w:tc>
+          <w:tcPr>
+            <w:tcW w:type="dxa" w:w="2952"/>
+            <w:tcMar>
+              <w:top w:w="110" w:type="dxa"/>
+              <w:start w:w="120" w:type="dxa"/>
+              <w:bottom w:w="110" w:type="dxa"/>
+              <w:end w:w="120" w:type="dxa"/>
+            </w:tcMar>
+            <w:vAlign w:val="center"/>
+            <w:shd w:fill="EAF1F5"/>
+          </w:tcPr>
+          <w:p>
+            <w:pPr>
+              <w:spacing w:after="0" w:line="245" w:lineRule="auto"/>
+            </w:pPr>
+            <w:r>
+              <w:rPr>
+                <w:sz w:val="17"/>
+              </w:rPr>
+              <w:t>CSV/PDF/XML и ограниченная по правам WAV-запись реализованы</w:t>
+            </w:r>
+          </w:p>
+        </w:tc>
+        <w:tc>
+          <w:tcPr>
+            <w:tcW w:type="dxa" w:w="3816"/>
+            <w:tcMar>
+              <w:top w:w="110" w:type="dxa"/>
+              <w:start w:w="120" w:type="dxa"/>
+              <w:bottom w:w="110" w:type="dxa"/>
+              <w:end w:w="120" w:type="dxa"/>
+            </w:tcMar>
+            <w:vAlign w:val="center"/>
+            <w:shd w:fill="EAF1F5"/>
+          </w:tcPr>
+          <w:p>
+            <w:pPr>
+              <w:spacing w:after="0" w:line="245" w:lineRule="auto"/>
+            </w:pPr>
+            <w:r>
+              <w:rPr>
+                <w:sz w:val="17"/>
+              </w:rPr>
+              <w:t>Проверить целевой рабочий процесс, две аудиодорожки и резервное копирование записей</w:t>
+            </w:r>
+          </w:p>
+        </w:tc>
+      </w:tr>
+      <w:tr>
+        <w:trPr>
+          <w:cantSplit/>
+        </w:trPr>
+        <w:tc>
+          <w:tcPr>
+            <w:tcW w:type="dxa" w:w="2880"/>
+            <w:tcMar>
+              <w:top w:w="110" w:type="dxa"/>
+              <w:start w:w="120" w:type="dxa"/>
+              <w:bottom w:w="110" w:type="dxa"/>
+              <w:end w:w="120" w:type="dxa"/>
+            </w:tcMar>
+            <w:vAlign w:val="center"/>
+          </w:tcPr>
+          <w:p>
+            <w:pPr>
+              <w:spacing w:after="0" w:line="245" w:lineRule="auto"/>
+            </w:pPr>
+            <w:r>
+              <w:rPr>
+                <w:sz w:val="17"/>
+              </w:rPr>
               <w:t>Сертификат PDF</w:t>
             </w:r>
           </w:p>
@@ -6954,7 +7430,7 @@
               <w:rPr>
                 <w:sz w:val="17"/>
               </w:rPr>
-              <w:t>Не реализован</w:t>
+              <w:t>PDF-сертификат по сохранённым оценкам реализован</w:t>
             </w:r>
           </w:p>
         </w:tc>
@@ -6977,7 +7453,7 @@
               <w:rPr>
                 <w:sz w:val="17"/>
               </w:rPr>
-              <w:t>Шаблон сертификата и правила выдачи</w:t>
+              <w:t>Это не документ установленного образца; согласовать методику выдачи</w:t>
             </w:r>
           </w:p>
         </w:tc>
@@ -7067,7 +7543,7 @@
     </w:p>
     <w:p>
       <w:r>
-        <w:t>Эти пункты нельзя считать выполненными по наличию документации или имитации. Они остаются в реестре разрывов docs/spec/GAP.md до появления кода и приёмочных измерений.</w:t>
+        <w:t>Реализация и подтверждение на целевом стенде — разные статусы. Открытые приёмочные задачи и ограничения полного ТЗ перечислены в docs/spec/GAP.md. Документ не объявляет локальные smoke-тесты приёмкой заказчика.</w:t>
       </w:r>
     </w:p>
     <w:p>

</xml_diff>